<commit_message>
Paper v0.5.1: add authors (Apartsin, Aperstein) and affiliations
Authors:
- Alexander Apartsin (Holon Institute of Technology, Israel)
- Yehudit Aperstein (Afeka College of Engineering, Israel)

BibTeX entry updated. CSS adjustments for the authors and affiliations
block in the title header. DOCX regenerated.

Co-Authored-By: Claude Opus 4.7 (1M context) <noreply@anthropic.com>
</commit_message>
<xml_diff>
--- a/docs/attrforge.docx
+++ b/docs/attrforge.docx
@@ -69,9 +69,81 @@
       </w:pPr>
       <w:r>
         <w:rPr>
+          <w:b/>
+          <w:bCs/>
           <w:sz w:val="20"/>
         </w:rPr>
-        <w:t xml:space="preserve">AttrForge Contributors</w:t>
+        <w:t xml:space="preserve">Alexander Apartsin</w:t>
+      </w:r>
+      <w:r>
+        <w:rPr>
+          <w:sz w:val="20"/>
+          <w:vertAlign w:val="superscript"/>
+        </w:rPr>
+        <w:t xml:space="preserve">1</w:t>
+      </w:r>
+      <w:r>
+        <w:rPr>
+          <w:sz w:val="20"/>
+        </w:rPr>
+        <w:t xml:space="preserve"> </w:t>
+      </w:r>
+      <w:r>
+        <w:rPr>
+          <w:sz w:val="20"/>
+        </w:rPr>
+        <w:t xml:space="preserve">·</w:t>
+      </w:r>
+      <w:r>
+        <w:rPr>
+          <w:sz w:val="20"/>
+        </w:rPr>
+        <w:t xml:space="preserve"> </w:t>
+      </w:r>
+      <w:r>
+        <w:rPr>
+          <w:b/>
+          <w:bCs/>
+          <w:sz w:val="20"/>
+        </w:rPr>
+        <w:t xml:space="preserve">Yehudit Aperstein</w:t>
+      </w:r>
+      <w:r>
+        <w:rPr>
+          <w:sz w:val="20"/>
+          <w:vertAlign w:val="superscript"/>
+        </w:rPr>
+        <w:t xml:space="preserve">2</w:t>
+      </w:r>
+    </w:p>
+    <w:p>
+      <w:pPr>
+        <w:pStyle w:val="BodyText"/>
+        <w:jc w:val="both"/>
+        <w:keepNext w:val="0"/>
+        <w:keepLines w:val="0"/>
+        <w:widowControl w:val="1"/>
+      </w:pPr>
+      <w:r>
+        <w:rPr>
+          <w:vertAlign w:val="superscript"/>
+        </w:rPr>
+        <w:t xml:space="preserve">1</w:t>
+      </w:r>
+      <w:r>
+        <w:t xml:space="preserve">Holon Institute of Technology, Israel ·</w:t>
+      </w:r>
+      <w:r>
+        <w:t xml:space="preserve"> </w:t>
+      </w:r>
+      <w:r>
+        <w:rPr>
+          <w:vertAlign w:val="superscript"/>
+        </w:rPr>
+        <w:t xml:space="preserve">2</w:t>
+      </w:r>
+      <w:r>
+        <w:t xml:space="preserve">Afeka College of Engineering, Israel</w:t>
       </w:r>
     </w:p>
     <w:p>
@@ -15930,7 +16002,7 @@
         <w:rPr>
           <w:rStyle w:val="VerbatimChar"/>
         </w:rPr>
-        <w:t xml:space="preserve">@misc{attrforge2026,</w:t>
+        <w:t xml:space="preserve">@misc{apartsin2026attrforge,</w:t>
       </w:r>
       <w:r>
         <w:br/>
@@ -15939,7 +16011,7 @@
         <w:rPr>
           <w:rStyle w:val="VerbatimChar"/>
         </w:rPr>
-        <w:t xml:space="preserve">  title  = {AttrForge: Multi-Objective Prompt Debugging for Realistic,</w:t>
+        <w:t xml:space="preserve">  title  = {More Critics, Worse Data? {GAN}-Style Adversaries Expose a</w:t>
       </w:r>
       <w:r>
         <w:br/>
@@ -15948,7 +16020,7 @@
         <w:rPr>
           <w:rStyle w:val="VerbatimChar"/>
         </w:rPr>
-        <w:t xml:space="preserve">            Diverse, and Attribute-Controlled Synthetic Data Generation},</w:t>
+        <w:t xml:space="preserve">            Diversity-Discriminability Tradeoff in {LLM} Synthetic Data Generation},</w:t>
       </w:r>
       <w:r>
         <w:br/>
@@ -15957,7 +16029,7 @@
         <w:rPr>
           <w:rStyle w:val="VerbatimChar"/>
         </w:rPr>
-        <w:t xml:space="preserve">  author = {AttrForge Contributors},</w:t>
+        <w:t xml:space="preserve">  author = {Apartsin, Alexander and Aperstein, Yehudit},</w:t>
       </w:r>
       <w:r>
         <w:br/>
@@ -15975,7 +16047,7 @@
         <w:rPr>
           <w:rStyle w:val="VerbatimChar"/>
         </w:rPr>
-        <w:t xml:space="preserve">  note   = {Research preview, \url{https://github.com/ApartsinProjects/PromptForge}}</w:t>
+        <w:t xml:space="preserve">  note   = {Research preview, \url{https://apartsinprojects.github.io/PromptForge/}}</w:t>
       </w:r>
       <w:r>
         <w:br/>

</xml_diff>